<commit_message>
docs: pitch 4.2 con foco en solución y entregable final para el Drive
Rondas de prueba simuladas según la guía del evento, basadas en
testimonios públicos y marcadas como SIMULADAS.

Co-Authored-By: Claude Opus 5.5 <noreply@anthropic.com>
</commit_message>
<xml_diff>
--- a/entregables/entregables-evento/05_Elevator_pitch_1_minuto.docx
+++ b/entregables/entregables-evento/05_Elevator_pitch_1_minuto.docx
@@ -4,277 +4,7 @@
   <w:body>
     <w:p>
       <w:r>
-        <w:rPr>
-          <w:b/>
-          <w:color w:val="00614F"/>
-          <w:sz w:val="20"/>
-        </w:rPr>
-        <w:t>Hackathon Smart City Expo Cali 2026 · RETO-01 Cali Activa</w:t>
-      </w:r>
-    </w:p>
-    <w:p>
-      <w:r>
-        <w:rPr>
-          <w:b/>
-          <w:color w:val="003D4A"/>
-          <w:sz w:val="44"/>
-        </w:rPr>
-        <w:t>Entregable 5 · Elevator pitch de 1 minuto (4.2)</w:t>
-      </w:r>
-    </w:p>
-    <w:p>
-      <w:r>
-        <w:rPr>
-          <w:i/>
-          <w:sz w:val="25"/>
-        </w:rPr>
-        <w:t>Territorio Preparado: espacios y ayudas coordinados ante emergencias</w:t>
-      </w:r>
-    </w:p>
-    <w:tbl>
-      <w:tblPr>
-        <w:tblStyle w:val="TableGrid"/>
-        <w:tblW w:type="auto" w:w="0"/>
-        <w:jc w:val="center"/>
-        <w:tblLayout w:type="fixed"/>
-        <w:tblLook w:firstColumn="1" w:firstRow="1" w:lastColumn="0" w:lastRow="0" w:noHBand="0" w:noVBand="1" w:val="04A0"/>
-      </w:tblPr>
-      <w:tblGrid>
-        <w:gridCol w:w="2608"/>
-        <w:gridCol w:w="6803"/>
-      </w:tblGrid>
-      <w:tr>
-        <w:tc>
-          <w:tcPr>
-            <w:tcW w:type="dxa" w:w="2608"/>
-            <w:shd w:val="clear" w:color="auto" w:fill="E6F2EF"/>
-          </w:tcPr>
-          <w:p>
-            <w:r/>
-            <w:r>
-              <w:rPr>
-                <w:b/>
-                <w:sz w:val="19"/>
-              </w:rPr>
-              <w:t>Equipo</w:t>
-            </w:r>
-          </w:p>
-        </w:tc>
-        <w:tc>
-          <w:tcPr>
-            <w:tcW w:type="dxa" w:w="6803"/>
-          </w:tcPr>
-          <w:p>
-            <w:r/>
-            <w:r>
-              <w:rPr>
-                <w:sz w:val="19"/>
-              </w:rPr>
-              <w:t>William Ortiz · Herlin Echeverry · Pablo Arango · Bryan Martínez Villamarín</w:t>
-            </w:r>
-          </w:p>
-        </w:tc>
-      </w:tr>
-      <w:tr>
-        <w:tc>
-          <w:tcPr>
-            <w:tcW w:type="dxa" w:w="2608"/>
-            <w:shd w:val="clear" w:color="auto" w:fill="E6F2EF"/>
-          </w:tcPr>
-          <w:p>
-            <w:r/>
-            <w:r>
-              <w:rPr>
-                <w:b/>
-                <w:sz w:val="19"/>
-              </w:rPr>
-              <w:t>Reto</w:t>
-            </w:r>
-          </w:p>
-        </w:tc>
-        <w:tc>
-          <w:tcPr>
-            <w:tcW w:type="dxa" w:w="6803"/>
-          </w:tcPr>
-          <w:p>
-            <w:r/>
-            <w:r>
-              <w:rPr>
-                <w:sz w:val="19"/>
-              </w:rPr>
-              <w:t>RETO-01 Cali Activa: espacios públicos que se transforman para cuidar</w:t>
-            </w:r>
-          </w:p>
-        </w:tc>
-      </w:tr>
-      <w:tr>
-        <w:tc>
-          <w:tcPr>
-            <w:tcW w:type="dxa" w:w="2608"/>
-            <w:shd w:val="clear" w:color="auto" w:fill="E6F2EF"/>
-          </w:tcPr>
-          <w:p>
-            <w:r/>
-            <w:r>
-              <w:rPr>
-                <w:b/>
-                <w:sz w:val="19"/>
-              </w:rPr>
-              <w:t>Owner del reto</w:t>
-            </w:r>
-          </w:p>
-        </w:tc>
-        <w:tc>
-          <w:tcPr>
-            <w:tcW w:type="dxa" w:w="6803"/>
-          </w:tcPr>
-          <w:p>
-            <w:r/>
-            <w:r>
-              <w:rPr>
-                <w:sz w:val="19"/>
-              </w:rPr>
-              <w:t>Secretaría de Gestión del Riesgo de Emergencias y Desastres · líder técnico: DATIC</w:t>
-            </w:r>
-          </w:p>
-        </w:tc>
-      </w:tr>
-      <w:tr>
-        <w:tc>
-          <w:tcPr>
-            <w:tcW w:type="dxa" w:w="2608"/>
-            <w:shd w:val="clear" w:color="auto" w:fill="E6F2EF"/>
-          </w:tcPr>
-          <w:p>
-            <w:r/>
-            <w:r>
-              <w:rPr>
-                <w:b/>
-                <w:sz w:val="19"/>
-              </w:rPr>
-              <w:t>Fase del proceso</w:t>
-            </w:r>
-          </w:p>
-        </w:tc>
-        <w:tc>
-          <w:tcPr>
-            <w:tcW w:type="dxa" w:w="6803"/>
-          </w:tcPr>
-          <w:p>
-            <w:r/>
-            <w:r>
-              <w:rPr>
-                <w:sz w:val="19"/>
-              </w:rPr>
-              <w:t>Presentación final de pitches · Pitch final y materiales de soporte</w:t>
-            </w:r>
-          </w:p>
-        </w:tc>
-      </w:tr>
-      <w:tr>
-        <w:tc>
-          <w:tcPr>
-            <w:tcW w:type="dxa" w:w="2608"/>
-            <w:shd w:val="clear" w:color="auto" w:fill="E6F2EF"/>
-          </w:tcPr>
-          <w:p>
-            <w:r/>
-            <w:r>
-              <w:rPr>
-                <w:b/>
-                <w:sz w:val="19"/>
-              </w:rPr>
-              <w:t>Criterio de evaluación que evidencia</w:t>
-            </w:r>
-          </w:p>
-        </w:tc>
-        <w:tc>
-          <w:tcPr>
-            <w:tcW w:type="dxa" w:w="6803"/>
-          </w:tcPr>
-          <w:p>
-            <w:r/>
-            <w:r>
-              <w:rPr>
-                <w:sz w:val="19"/>
-              </w:rPr>
-              <w:t>Claridad y capacidad de síntesis del pitch (10 %)</w:t>
-            </w:r>
-          </w:p>
-        </w:tc>
-      </w:tr>
-      <w:tr>
-        <w:tc>
-          <w:tcPr>
-            <w:tcW w:type="dxa" w:w="2608"/>
-            <w:shd w:val="clear" w:color="auto" w:fill="E6F2EF"/>
-          </w:tcPr>
-          <w:p>
-            <w:r/>
-            <w:r>
-              <w:rPr>
-                <w:b/>
-                <w:sz w:val="19"/>
-              </w:rPr>
-              <w:t>Fecha</w:t>
-            </w:r>
-          </w:p>
-        </w:tc>
-        <w:tc>
-          <w:tcPr>
-            <w:tcW w:type="dxa" w:w="6803"/>
-          </w:tcPr>
-          <w:p>
-            <w:r/>
-            <w:r>
-              <w:rPr>
-                <w:sz w:val="19"/>
-              </w:rPr>
-              <w:t>Sábado 26 de septiembre de 2026</w:t>
-            </w:r>
-          </w:p>
-        </w:tc>
-      </w:tr>
-      <w:tr>
-        <w:tc>
-          <w:tcPr>
-            <w:tcW w:type="dxa" w:w="2608"/>
-            <w:shd w:val="clear" w:color="auto" w:fill="E6F2EF"/>
-          </w:tcPr>
-          <w:p>
-            <w:r/>
-            <w:r>
-              <w:rPr>
-                <w:b/>
-                <w:sz w:val="19"/>
-              </w:rPr>
-              <w:t>Prototipo público</w:t>
-            </w:r>
-          </w:p>
-        </w:tc>
-        <w:tc>
-          <w:tcPr>
-            <w:tcW w:type="dxa" w:w="6803"/>
-          </w:tcPr>
-          <w:p>
-            <w:r/>
-            <w:r>
-              <w:rPr>
-                <w:sz w:val="19"/>
-              </w:rPr>
-              <w:t>https://leonidas452528.github.io/hackaton-camaracomercio2026/</w:t>
-            </w:r>
-          </w:p>
-        </w:tc>
-      </w:tr>
-    </w:tbl>
-    <w:p/>
-    <w:p>
-      <w:pPr>
-        <w:pStyle w:val="Heading1"/>
-      </w:pPr>
-      <w:r>
-        <w:t>1. El texto completo</w:t>
+        <w:t>==============================================================</w:t>
       </w:r>
     </w:p>
     <w:p>
@@ -282,814 +12,104 @@
         <w:rPr>
           <w:b/>
         </w:rPr>
-        <w:t xml:space="preserve">Duración: </w:t>
+        <w:t>GUION DE PITCH: FOCO EN SOLUCIÓN (1 MINUTO / ~138 PALABRAS)</w:t>
       </w:r>
+    </w:p>
+    <w:p>
       <w:r>
-        <w:t>140 palabras, para leer a ritmo tranquilo en 60 segundos. Una sola voz. Si sobra tiempo, no se agrega nada: se habla más despacio.</w:t>
+        <w:t>Equipo: Territorio Preparado | Solución: Territorio Preparado | Reto: RETO-01 Cali Activa</w:t>
+      </w:r>
+    </w:p>
+    <w:p>
+      <w:r>
+        <w:t>Integrantes: William Ortiz, Herlin Echeverry, Pablo Arango, Bryan Martínez Villamarín</w:t>
+      </w:r>
+    </w:p>
+    <w:p>
+      <w:r>
+        <w:t>==============================================================</w:t>
       </w:r>
     </w:p>
     <w:p>
       <w:r>
         <w:rPr>
           <w:b/>
-          <w:color w:val="003D4A"/>
         </w:rPr>
-        <w:t xml:space="preserve">[0–15 s] El gancho. </w:t>
+        <w:t>[00:00 - 00:12] LA SOLUCIÓN</w:t>
       </w:r>
+    </w:p>
+    <w:p>
       <w:r>
-        <w:t>El 10 de agosto, tras el sismo, 1.046 personas se refugiaron en canchas de Chiminangos y Calimio que la comunidad convirtió en albergues. Esas canchas están a entre 72 y 152 metros del dique del río Cauca: huyeron de un sismo hacia una zona inundable.</w:t>
+        <w:t>"Nuestra solución es Territorio Preparado, una aplicación web que ayuda a la Secretaría de Gestión del Riesgo a preparar los espacios públicos de Cali para cada tipo de emergencia."</w:t>
       </w:r>
     </w:p>
     <w:p>
       <w:r>
         <w:rPr>
           <w:b/>
-          <w:color w:val="003D4A"/>
         </w:rPr>
-        <w:t xml:space="preserve">[15–25 s] El problema. </w:t>
+        <w:t>[00:12 - 00:47] DEMOSTRACIÓN FUNCIONAL (CÓMO OPERA)</w:t>
       </w:r>
+    </w:p>
+    <w:p>
       <w:r>
-        <w:t>Cali tiene 1.970 espacios públicos inventariados, pero hoy nadie sabe cuál sirve ante cada amenaza, qué le falta ni quién debe responder.</w:t>
+        <w:t>"Funciona en tres pasos. Primero, la Secretaría elige la amenaza, por ejemplo una creciente del río Cauca, y cuántas personas hay que atender. Segundo, el sistema cruza 1.970 espacios públicos con las amenazas del POT, descarta los expuestos y propone candidatos con cada criterio a la vista. Tercero, calcula cuánto cabe sin sobreocupar, cuánta agua y cuántos baños faltan y qué entidad responde por cada servicio, y entrega un borrador para que la autoridad decida."</w:t>
+      </w:r>
+    </w:p>
+    <w:p>
+      <w:r>
+        <w:rPr>
+          <w:i/>
+        </w:rPr>
+        <w:t>*(Indicación de cámara: Mostrar en pantalla el flujo: mapa filtrado por «Inundación» → ficha del espacio → cálculo 20 → 16 módulos → necesidades y entidad responsable → borrador exportado.)*</w:t>
       </w:r>
     </w:p>
     <w:p>
       <w:r>
         <w:rPr>
           <w:b/>
-          <w:color w:val="003D4A"/>
         </w:rPr>
-        <w:t xml:space="preserve">[25–48 s] La solución. </w:t>
-      </w:r>
-      <w:r>
-        <w:t>Territorio Preparado cruza datos abiertos del POT, IDESC y Copernicus. Eliges la amenaza y la población; el sistema descarta los espacios expuestos, propone candidatos, calcula cuánto cabe sin sobreocupar, cuánta agua y cuántos baños faltan, y qué entidad responde. Cada criterio queda a la vista.</w:t>
+        <w:t>[00:47 - 01:00] IMPACTO Y CIERRE</w:t>
       </w:r>
     </w:p>
     <w:p>
       <w:r>
-        <w:rPr>
-          <w:b/>
-          <w:color w:val="003D4A"/>
-        </w:rPr>
-        <w:t xml:space="preserve">[48–60 s] El cierre. </w:t>
-      </w:r>
-      <w:r>
-        <w:t>Ya funciona en línea con el mapa real de Cali. Que la próxima vez el parque esté listo antes de la emergencia. Territorio Preparado propone; la autoridad decide.</w:t>
-      </w:r>
-    </w:p>
-    <w:p>
-      <w:pPr>
-        <w:pStyle w:val="Heading1"/>
-      </w:pPr>
-      <w:r>
-        <w:t>2. Guion con diapositivas</w:t>
-      </w:r>
-    </w:p>
-    <w:tbl>
-      <w:tblPr>
-        <w:tblStyle w:val="TableGrid"/>
-        <w:tblW w:type="auto" w:w="0"/>
-        <w:jc w:val="center"/>
-        <w:tblLayout w:type="fixed"/>
-        <w:tblLook w:firstColumn="1" w:firstRow="1" w:lastColumn="0" w:lastRow="0" w:noHBand="0" w:noVBand="1" w:val="04A0"/>
-      </w:tblPr>
-      <w:tblGrid>
-        <w:gridCol w:w="1134"/>
-        <w:gridCol w:w="2608"/>
-        <w:gridCol w:w="5669"/>
-      </w:tblGrid>
-      <w:tr>
-        <w:tc>
-          <w:tcPr>
-            <w:tcW w:type="dxa" w:w="1134"/>
-            <w:shd w:val="clear" w:color="auto" w:fill="00614F"/>
-          </w:tcPr>
-          <w:p>
-            <w:r/>
-            <w:r>
-              <w:rPr>
-                <w:b/>
-                <w:color w:val="FFFFFF"/>
-                <w:sz w:val="19"/>
-              </w:rPr>
-              <w:t>Tiempo</w:t>
-            </w:r>
-          </w:p>
-        </w:tc>
-        <w:tc>
-          <w:tcPr>
-            <w:tcW w:type="dxa" w:w="2608"/>
-            <w:shd w:val="clear" w:color="auto" w:fill="00614F"/>
-          </w:tcPr>
-          <w:p>
-            <w:r/>
-            <w:r>
-              <w:rPr>
-                <w:b/>
-                <w:color w:val="FFFFFF"/>
-                <w:sz w:val="19"/>
-              </w:rPr>
-              <w:t>Diapositiva</w:t>
-            </w:r>
-          </w:p>
-        </w:tc>
-        <w:tc>
-          <w:tcPr>
-            <w:tcW w:type="dxa" w:w="5669"/>
-            <w:shd w:val="clear" w:color="auto" w:fill="00614F"/>
-          </w:tcPr>
-          <w:p>
-            <w:r/>
-            <w:r>
-              <w:rPr>
-                <w:b/>
-                <w:color w:val="FFFFFF"/>
-                <w:sz w:val="19"/>
-              </w:rPr>
-              <w:t>Qué se dice</w:t>
-            </w:r>
-          </w:p>
-        </w:tc>
-      </w:tr>
-      <w:tr>
-        <w:tc>
-          <w:tcPr>
-            <w:tcW w:type="dxa" w:w="1134"/>
-          </w:tcPr>
-          <w:p>
-            <w:r/>
-            <w:r>
-              <w:rPr>
-                <w:sz w:val="19"/>
-              </w:rPr>
-              <w:t>0–15 s</w:t>
-            </w:r>
-          </w:p>
-        </w:tc>
-        <w:tc>
-          <w:tcPr>
-            <w:tcW w:type="dxa" w:w="2608"/>
-          </w:tcPr>
-          <w:p>
-            <w:r/>
-            <w:r>
-              <w:rPr>
-                <w:sz w:val="19"/>
-              </w:rPr>
-              <w:t>El gancho: Mapa de la app filtrado por «Inundación» en Calimio</w:t>
-            </w:r>
-          </w:p>
-        </w:tc>
-        <w:tc>
-          <w:tcPr>
-            <w:tcW w:type="dxa" w:w="5669"/>
-          </w:tcPr>
-          <w:p>
-            <w:r/>
-            <w:r>
-              <w:rPr>
-                <w:sz w:val="19"/>
-              </w:rPr>
-              <w:t>El 10 de agosto, tras el sismo, 1.046 personas se refugiaron en canchas de Chiminangos y Calimio que la comunidad convirtió en albergues. Esas canchas están a entre 72 y 152 metros del dique del río Cauca: huyeron de un sismo hacia una zona inundable.</w:t>
-            </w:r>
-          </w:p>
-        </w:tc>
-      </w:tr>
-      <w:tr>
-        <w:tc>
-          <w:tcPr>
-            <w:tcW w:type="dxa" w:w="1134"/>
-          </w:tcPr>
-          <w:p>
-            <w:r/>
-            <w:r>
-              <w:rPr>
-                <w:sz w:val="19"/>
-              </w:rPr>
-              <w:t>15–25 s</w:t>
-            </w:r>
-          </w:p>
-        </w:tc>
-        <w:tc>
-          <w:tcPr>
-            <w:tcW w:type="dxa" w:w="2608"/>
-          </w:tcPr>
-          <w:p>
-            <w:r/>
-            <w:r>
-              <w:rPr>
-                <w:sz w:val="19"/>
-              </w:rPr>
-              <w:t>El problema: Cifra grande: «1.970 espacios públicos. ¿Cuál sirve para qué?»</w:t>
-            </w:r>
-          </w:p>
-        </w:tc>
-        <w:tc>
-          <w:tcPr>
-            <w:tcW w:type="dxa" w:w="5669"/>
-          </w:tcPr>
-          <w:p>
-            <w:r/>
-            <w:r>
-              <w:rPr>
-                <w:sz w:val="19"/>
-              </w:rPr>
-              <w:t>Cali tiene 1.970 espacios públicos inventariados, pero hoy nadie sabe cuál sirve ante cada amenaza, qué le falta ni quién debe responder.</w:t>
-            </w:r>
-          </w:p>
-        </w:tc>
-      </w:tr>
-      <w:tr>
-        <w:tc>
-          <w:tcPr>
-            <w:tcW w:type="dxa" w:w="1134"/>
-          </w:tcPr>
-          <w:p>
-            <w:r/>
-            <w:r>
-              <w:rPr>
-                <w:sz w:val="19"/>
-              </w:rPr>
-              <w:t>25–48 s</w:t>
-            </w:r>
-          </w:p>
-        </w:tc>
-        <w:tc>
-          <w:tcPr>
-            <w:tcW w:type="dxa" w:w="2608"/>
-          </w:tcPr>
-          <w:p>
-            <w:r/>
-            <w:r>
-              <w:rPr>
-                <w:sz w:val="19"/>
-              </w:rPr>
-              <w:t>La solución: Ficha del espacio y cálculo 20 → 16</w:t>
-            </w:r>
-          </w:p>
-        </w:tc>
-        <w:tc>
-          <w:tcPr>
-            <w:tcW w:type="dxa" w:w="5669"/>
-          </w:tcPr>
-          <w:p>
-            <w:r/>
-            <w:r>
-              <w:rPr>
-                <w:sz w:val="19"/>
-              </w:rPr>
-              <w:t>Territorio Preparado cruza datos abiertos del POT, IDESC y Copernicus. Eliges la amenaza y la población; el sistema descarta los espacios expuestos, propone candidatos, calcula cuánto cabe sin sobreocupar, cuánta agua y cuántos baños faltan, y qué entidad responde. Cada criterio queda a la vista.</w:t>
-            </w:r>
-          </w:p>
-        </w:tc>
-      </w:tr>
-      <w:tr>
-        <w:tc>
-          <w:tcPr>
-            <w:tcW w:type="dxa" w:w="1134"/>
-          </w:tcPr>
-          <w:p>
-            <w:r/>
-            <w:r>
-              <w:rPr>
-                <w:sz w:val="19"/>
-              </w:rPr>
-              <w:t>48–60 s</w:t>
-            </w:r>
-          </w:p>
-        </w:tc>
-        <w:tc>
-          <w:tcPr>
-            <w:tcW w:type="dxa" w:w="2608"/>
-          </w:tcPr>
-          <w:p>
-            <w:r/>
-            <w:r>
-              <w:rPr>
-                <w:sz w:val="19"/>
-              </w:rPr>
-              <w:t>El cierre: Logo y lema</w:t>
-            </w:r>
-          </w:p>
-        </w:tc>
-        <w:tc>
-          <w:tcPr>
-            <w:tcW w:type="dxa" w:w="5669"/>
-          </w:tcPr>
-          <w:p>
-            <w:r/>
-            <w:r>
-              <w:rPr>
-                <w:sz w:val="19"/>
-              </w:rPr>
-              <w:t>Ya funciona en línea con el mapa real de Cali. Que la próxima vez el parque esté listo antes de la emergencia. Territorio Preparado propone; la autoridad decide.</w:t>
-            </w:r>
-          </w:p>
-        </w:tc>
-      </w:tr>
-    </w:tbl>
-    <w:p/>
-    <w:p>
-      <w:pPr>
-        <w:pStyle w:val="Heading1"/>
-      </w:pPr>
-      <w:r>
-        <w:t>3. De dónde sale cada cifra</w:t>
-      </w:r>
-    </w:p>
-    <w:tbl>
-      <w:tblPr>
-        <w:tblStyle w:val="TableGrid"/>
-        <w:tblW w:type="auto" w:w="0"/>
-        <w:jc w:val="center"/>
-        <w:tblLayout w:type="fixed"/>
-        <w:tblLook w:firstColumn="1" w:firstRow="1" w:lastColumn="0" w:lastRow="0" w:noHBand="0" w:noVBand="1" w:val="04A0"/>
-      </w:tblPr>
-      <w:tblGrid>
-        <w:gridCol w:w="3969"/>
-        <w:gridCol w:w="5443"/>
-      </w:tblGrid>
-      <w:tr>
-        <w:tc>
-          <w:tcPr>
-            <w:tcW w:type="dxa" w:w="3969"/>
-            <w:shd w:val="clear" w:color="auto" w:fill="00614F"/>
-          </w:tcPr>
-          <w:p>
-            <w:r/>
-            <w:r>
-              <w:rPr>
-                <w:b/>
-                <w:color w:val="FFFFFF"/>
-                <w:sz w:val="19"/>
-              </w:rPr>
-              <w:t>Cifra</w:t>
-            </w:r>
-          </w:p>
-        </w:tc>
-        <w:tc>
-          <w:tcPr>
-            <w:tcW w:type="dxa" w:w="5443"/>
-            <w:shd w:val="clear" w:color="auto" w:fill="00614F"/>
-          </w:tcPr>
-          <w:p>
-            <w:r/>
-            <w:r>
-              <w:rPr>
-                <w:b/>
-                <w:color w:val="FFFFFF"/>
-                <w:sz w:val="19"/>
-              </w:rPr>
-              <w:t>Fuente</w:t>
-            </w:r>
-          </w:p>
-        </w:tc>
-      </w:tr>
-      <w:tr>
-        <w:tc>
-          <w:tcPr>
-            <w:tcW w:type="dxa" w:w="3969"/>
-          </w:tcPr>
-          <w:p>
-            <w:r/>
-            <w:r>
-              <w:rPr>
-                <w:sz w:val="19"/>
-              </w:rPr>
-              <w:t>1.046 personas (336 familias) en 3 albergues autogestionados</w:t>
-            </w:r>
-          </w:p>
-        </w:tc>
-        <w:tc>
-          <w:tcPr>
-            <w:tcW w:type="dxa" w:w="5443"/>
-          </w:tcPr>
-          <w:p>
-            <w:r/>
-            <w:r>
-              <w:rPr>
-                <w:sz w:val="19"/>
-              </w:rPr>
-              <w:t>Defensoría del Pueblo</w:t>
-            </w:r>
-          </w:p>
-        </w:tc>
-      </w:tr>
-      <w:tr>
-        <w:tc>
-          <w:tcPr>
-            <w:tcW w:type="dxa" w:w="3969"/>
-          </w:tcPr>
-          <w:p>
-            <w:r/>
-            <w:r>
-              <w:rPr>
-                <w:sz w:val="19"/>
-              </w:rPr>
-              <w:t>A entre 72 y 152 m del dique; amenaza alta de inundación</w:t>
-            </w:r>
-          </w:p>
-        </w:tc>
-        <w:tc>
-          <w:tcPr>
-            <w:tcW w:type="dxa" w:w="5443"/>
-          </w:tcPr>
-          <w:p>
-            <w:r/>
-            <w:r>
-              <w:rPr>
-                <w:sz w:val="19"/>
-              </w:rPr>
-              <w:t>Cruce propio: amenazas del POT (IDESC, Acuerdo 0373 de 2014) + espacio público DAPM/IDESC</w:t>
-            </w:r>
-          </w:p>
-        </w:tc>
-      </w:tr>
-      <w:tr>
-        <w:tc>
-          <w:tcPr>
-            <w:tcW w:type="dxa" w:w="3969"/>
-          </w:tcPr>
-          <w:p>
-            <w:r/>
-            <w:r>
-              <w:rPr>
-                <w:sz w:val="19"/>
-              </w:rPr>
-              <w:t>1.970 espacios públicos inventariados</w:t>
-            </w:r>
-          </w:p>
-        </w:tc>
-        <w:tc>
-          <w:tcPr>
-            <w:tcW w:type="dxa" w:w="5443"/>
-          </w:tcPr>
-          <w:p>
-            <w:r/>
-            <w:r>
-              <w:rPr>
-                <w:sz w:val="19"/>
-              </w:rPr>
-              <w:t>DAPM/IDESC, datos abiertos de Cali</w:t>
-            </w:r>
-          </w:p>
-        </w:tc>
-      </w:tr>
-      <w:tr>
-        <w:tc>
-          <w:tcPr>
-            <w:tcW w:type="dxa" w:w="3969"/>
-          </w:tcPr>
-          <w:p>
-            <w:r/>
-            <w:r>
-              <w:rPr>
-                <w:sz w:val="19"/>
-              </w:rPr>
-              <w:t>20 → 16 módulos (si se muestra en pantalla)</w:t>
-            </w:r>
-          </w:p>
-        </w:tc>
-        <w:tc>
-          <w:tcPr>
-            <w:tcW w:type="dxa" w:w="5443"/>
-          </w:tcPr>
-          <w:p>
-            <w:r/>
-            <w:r>
-              <w:rPr>
-                <w:sz w:val="19"/>
-              </w:rPr>
-              <w:t>Cálculo por área del caso epou-9465 con reservas SIMULADAS</w:t>
-            </w:r>
-          </w:p>
-        </w:tc>
-      </w:tr>
-    </w:tbl>
-    <w:p/>
-    <w:p>
-      <w:pPr>
-        <w:pStyle w:val="Heading1"/>
-      </w:pPr>
-      <w:r>
-        <w:t>4. Reglas para no perder puntos</w:t>
-      </w:r>
-    </w:p>
-    <w:p>
-      <w:pPr>
-        <w:pStyle w:val="ListBullet"/>
-      </w:pPr>
-      <w:r>
-        <w:t>Decir «candidatos que la autoridad revisa», nunca «los mejores lugares» ni «lugares habilitados» (Ley 1523 de 2012).</w:t>
-      </w:r>
-    </w:p>
-    <w:p>
-      <w:pPr>
-        <w:pStyle w:val="ListBullet"/>
-      </w:pPr>
-      <w:r>
-        <w:t>El 20 → 16 es un cálculo por área con datos simulados: no afirmar que «caben 16 familias».</w:t>
-      </w:r>
-    </w:p>
-    <w:p>
-      <w:pPr>
-        <w:pStyle w:val="ListBullet"/>
-      </w:pPr>
-      <w:r>
-        <w:t>No mencionar la cifra de fallecidos: las fuentes no coinciden (105 frente a 154).</w:t>
-      </w:r>
-    </w:p>
-    <w:p>
-      <w:pPr>
-        <w:pStyle w:val="ListBullet"/>
-      </w:pPr>
-      <w:r>
-        <w:t>Decir «Territorio Preparado», que responde al reto Cali Activa.</w:t>
-      </w:r>
-    </w:p>
-    <w:p>
-      <w:pPr>
-        <w:pStyle w:val="ListBullet"/>
-      </w:pPr>
-      <w:r>
-        <w:t>Ensayar con cronómetro al menos tres veces.</w:t>
-      </w:r>
-    </w:p>
-    <w:p>
-      <w:pPr>
-        <w:pStyle w:val="Heading1"/>
-      </w:pPr>
-      <w:r>
-        <w:t>5. Respuestas de 10 segundos para el jurado</w:t>
-      </w:r>
-    </w:p>
-    <w:tbl>
-      <w:tblPr>
-        <w:tblStyle w:val="TableGrid"/>
-        <w:tblW w:type="auto" w:w="0"/>
-        <w:jc w:val="center"/>
-        <w:tblLayout w:type="fixed"/>
-        <w:tblLook w:firstColumn="1" w:firstRow="1" w:lastColumn="0" w:lastRow="0" w:noHBand="0" w:noVBand="1" w:val="04A0"/>
-      </w:tblPr>
-      <w:tblGrid>
-        <w:gridCol w:w="2835"/>
-        <w:gridCol w:w="6576"/>
-      </w:tblGrid>
-      <w:tr>
-        <w:tc>
-          <w:tcPr>
-            <w:tcW w:type="dxa" w:w="2835"/>
-            <w:shd w:val="clear" w:color="auto" w:fill="00614F"/>
-          </w:tcPr>
-          <w:p>
-            <w:r/>
-            <w:r>
-              <w:rPr>
-                <w:b/>
-                <w:color w:val="FFFFFF"/>
-                <w:sz w:val="19"/>
-              </w:rPr>
-              <w:t>Pregunta</w:t>
-            </w:r>
-          </w:p>
-        </w:tc>
-        <w:tc>
-          <w:tcPr>
-            <w:tcW w:type="dxa" w:w="6576"/>
-            <w:shd w:val="clear" w:color="auto" w:fill="00614F"/>
-          </w:tcPr>
-          <w:p>
-            <w:r/>
-            <w:r>
-              <w:rPr>
-                <w:b/>
-                <w:color w:val="FFFFFF"/>
-                <w:sz w:val="19"/>
-              </w:rPr>
-              <w:t>Respuesta</w:t>
-            </w:r>
-          </w:p>
-        </w:tc>
-      </w:tr>
-      <w:tr>
-        <w:tc>
-          <w:tcPr>
-            <w:tcW w:type="dxa" w:w="2835"/>
-          </w:tcPr>
-          <w:p>
-            <w:r/>
-            <w:r>
-              <w:rPr>
-                <w:sz w:val="19"/>
-              </w:rPr>
-              <w:t>¿Qué es real y qué es simulado?</w:t>
-            </w:r>
-          </w:p>
-        </w:tc>
-        <w:tc>
-          <w:tcPr>
-            <w:tcW w:type="dxa" w:w="6576"/>
-          </w:tcPr>
-          <w:p>
-            <w:r/>
-            <w:r>
-              <w:rPr>
-                <w:sz w:val="19"/>
-              </w:rPr>
-              <w:t>Los espacios, las amenazas y los daños del sismo son reales y públicos. La población del escenario, las reservas de área, el IoT y los SMS están simulados y así se marcan en pantalla.</w:t>
-            </w:r>
-          </w:p>
-        </w:tc>
-      </w:tr>
-      <w:tr>
-        <w:tc>
-          <w:tcPr>
-            <w:tcW w:type="dxa" w:w="2835"/>
-          </w:tcPr>
-          <w:p>
-            <w:r/>
-            <w:r>
-              <w:rPr>
-                <w:sz w:val="19"/>
-              </w:rPr>
-              <w:t>¿Y los datos personales?</w:t>
-            </w:r>
-          </w:p>
-        </w:tc>
-        <w:tc>
-          <w:tcPr>
-            <w:tcW w:type="dxa" w:w="6576"/>
-          </w:tcPr>
-          <w:p>
-            <w:r/>
-            <w:r>
-              <w:rPr>
-                <w:sz w:val="19"/>
-              </w:rPr>
-              <w:t>No se usan. Solo conteos agregados, sin datos de menores ni reconocimiento facial (Ley 1581 de 2012 y Ley 1098 de 2006).</w:t>
-            </w:r>
-          </w:p>
-        </w:tc>
-      </w:tr>
-      <w:tr>
-        <w:tc>
-          <w:tcPr>
-            <w:tcW w:type="dxa" w:w="2835"/>
-          </w:tcPr>
-          <w:p>
-            <w:r/>
-            <w:r>
-              <w:rPr>
-                <w:sz w:val="19"/>
-              </w:rPr>
-              <w:t>¿Reemplaza a los ingenieros o a Bomberos?</w:t>
-            </w:r>
-          </w:p>
-        </w:tc>
-        <w:tc>
-          <w:tcPr>
-            <w:tcW w:type="dxa" w:w="6576"/>
-          </w:tcPr>
-          <w:p>
-            <w:r/>
-            <w:r>
-              <w:rPr>
-                <w:sz w:val="19"/>
-              </w:rPr>
-              <w:t>No. Solo registra si existe una evaluación estructural vigente (NSR-10) y no emite conceptos de Bomberos (Ley 1575 de 2012).</w:t>
-            </w:r>
-          </w:p>
-        </w:tc>
-      </w:tr>
-      <w:tr>
-        <w:tc>
-          <w:tcPr>
-            <w:tcW w:type="dxa" w:w="2835"/>
-          </w:tcPr>
-          <w:p>
-            <w:r/>
-            <w:r>
-              <w:rPr>
-                <w:sz w:val="19"/>
-              </w:rPr>
-              <w:t>¿Lo validaron con usuarios?</w:t>
-            </w:r>
-          </w:p>
-        </w:tc>
-        <w:tc>
-          <w:tcPr>
-            <w:tcW w:type="dxa" w:w="6576"/>
-          </w:tcPr>
-          <w:p>
-            <w:r/>
-            <w:r>
-              <w:rPr>
-                <w:sz w:val="19"/>
-              </w:rPr>
-              <w:t>Tenemos evidencia documental de la Defensoría y OCHA. El siguiente paso es validarlo con la Secretaría de Gestión del Riesgo y las JAC de Chiminangos y Calimio.</w:t>
-            </w:r>
-          </w:p>
-        </w:tc>
-      </w:tr>
-      <w:tr>
-        <w:tc>
-          <w:tcPr>
-            <w:tcW w:type="dxa" w:w="2835"/>
-          </w:tcPr>
-          <w:p>
-            <w:r/>
-            <w:r>
-              <w:rPr>
-                <w:sz w:val="19"/>
-              </w:rPr>
-              <w:t>¿Cómo escala?</w:t>
-            </w:r>
-          </w:p>
-        </w:tc>
-        <w:tc>
-          <w:tcPr>
-            <w:tcW w:type="dxa" w:w="6576"/>
-          </w:tcPr>
-          <w:p>
-            <w:r/>
-            <w:r>
-              <w:rPr>
-                <w:sz w:val="19"/>
-              </w:rPr>
-              <w:t>Es una aplicación web con datos abiertos. Con una base compartida, cada comuna puede alimentar su inventario.</w:t>
-            </w:r>
-          </w:p>
-        </w:tc>
-      </w:tr>
-    </w:tbl>
-    <w:p/>
-    <w:p>
-      <w:pPr>
-        <w:pStyle w:val="Heading1"/>
-      </w:pPr>
-      <w:r>
-        <w:t>Fuentes</w:t>
-      </w:r>
-    </w:p>
-    <w:p>
-      <w:pPr>
-        <w:pStyle w:val="ListBullet"/>
-      </w:pPr>
-      <w:r>
-        <w:rPr>
-          <w:b/>
-        </w:rPr>
-        <w:t xml:space="preserve">Defensoría del Pueblo: 336 familias en albergues de Cali: </w:t>
-      </w:r>
-      <w:r>
-        <w:t>https://www.defensoria.gov.co/web/guest/-/defensoria-pide-atencion-urgente-para-336-familias-en-albergues-de-cali</w:t>
-      </w:r>
-    </w:p>
-    <w:p>
-      <w:pPr>
-        <w:pStyle w:val="ListBullet"/>
-      </w:pPr>
-      <w:r>
-        <w:rPr>
-          <w:b/>
-        </w:rPr>
-        <w:t xml:space="preserve">DAPM/IDESC: espacio público efectivo (datos abiertos de Cali): </w:t>
-      </w:r>
-      <w:r>
-        <w:t>https://datos.cali.gov.co/dataset/epou-espacio-publico-efectivo</w:t>
+        <w:t>"Tras el sismo, 1.046 personas se refugiaron en canchas a entre 72 y 152 metros del dique del Cauca. Que la próxima vez el parque esté listo antes. Territorio Preparado propone; la autoridad decide."</w:t>
       </w:r>
     </w:p>
     <w:p>
       <w:r>
-        <w:t>Bitácora completa con todas las fuentes: https://github.com/leonidas452528/hackaton-camaracomercio2026/blob/main/docs/PROYECTO.md</w:t>
+        <w:t>==============================================================</w:t>
+      </w:r>
+    </w:p>
+    <w:p>
+      <w:r>
+        <w:t>TIEMPO ESTIMADO: 60 SEGUNDOS.</w:t>
+      </w:r>
+    </w:p>
+    <w:p>
+      <w:r>
+        <w:t>RECOMENDACIÓN DE ENSAYO: leer a un ritmo de 2,3 palabras por segundo. Decir «candidatos», nunca «los mejores lugares».</w:t>
+      </w:r>
+    </w:p>
+    <w:p>
+      <w:r>
+        <w:t>FUENTES: 1.046 personas en albergues autogestionados (Defensoría del Pueblo); 72 a 152 m del dique (cruce propio POT/IDESC); 1.970 espacios públicos (DAPM/IDESC). El 20 → 16 es un cálculo por área con reservas SIMULADAS.</w:t>
+      </w:r>
+    </w:p>
+    <w:p>
+      <w:r>
+        <w:t>==============================================================</w:t>
       </w:r>
     </w:p>
     <w:sectPr>
-      <w:footerReference w:type="default" r:id="rId9"/>
       <w:pgSz w:w="12240" w:h="15840"/>
-      <w:pgMar w:top="1134" w:right="1247" w:bottom="1134" w:left="1247" w:header="720" w:footer="720" w:gutter="0"/>
+      <w:pgMar w:top="1440" w:right="1800" w:bottom="1440" w:left="1800" w:header="720" w:footer="720" w:gutter="0"/>
       <w:cols w:space="720"/>
       <w:docGrid w:linePitch="360"/>
     </w:sectPr>
   </w:body>
 </w:document>
-</file>
-
-<file path=word/footer1.xml><?xml version="1.0" encoding="utf-8"?>
-<w:ftr xmlns:m="http://schemas.openxmlformats.org/officeDocument/2006/math" xmlns:mc="http://schemas.openxmlformats.org/markup-compatibility/2006" xmlns:mo="http://schemas.microsoft.com/office/mac/office/2008/main" xmlns:mv="urn:schemas-microsoft-com:mac:vml" xmlns:o="urn:schemas-microsoft-com:office:office" xmlns:r="http://schemas.openxmlformats.org/officeDocument/2006/relationships" xmlns:v="urn:schemas-microsoft-com:vml" xmlns:w10="urn:schemas-microsoft-com:office:word" xmlns:w14="http://schemas.microsoft.com/office/word/2010/wordml" xmlns:w="http://schemas.openxmlformats.org/wordprocessingml/2006/main" xmlns:wne="http://schemas.microsoft.com/office/word/2006/wordml" xmlns:wp14="http://schemas.microsoft.com/office/word/2010/wordprocessingDrawing" xmlns:wp="http://schemas.openxmlformats.org/drawingml/2006/wordprocessingDrawing" xmlns:wpc="http://schemas.microsoft.com/office/word/2010/wordprocessingCanvas" xmlns:wpg="http://schemas.microsoft.com/office/word/2010/wordprocessingGroup" xmlns:wpi="http://schemas.microsoft.com/office/word/2010/wordprocessingInk" xmlns:wps="http://schemas.microsoft.com/office/word/2010/wordprocessingShape" mc:Ignorable="w14 wp14">
-  <w:p>
-    <w:pPr>
-      <w:pStyle w:val="Footer"/>
-      <w:jc w:val="center"/>
-    </w:pPr>
-    <w:r>
-      <w:rPr>
-        <w:color w:val="555F66"/>
-        <w:sz w:val="17"/>
-      </w:rPr>
-      <w:t>Territorio Preparado · Entregable 5 · Elevator pitch de 1 minuto (4.2)</w:t>
-    </w:r>
-  </w:p>
-</w:ftr>
 </file>
 
 <file path=word/numbering.xml><?xml version="1.0" encoding="utf-8"?>
@@ -1456,11 +476,10 @@
     <w:qFormat/>
     <w:rsid w:val="00FC693F"/>
     <w:pPr>
-      <w:spacing w:after="120" w:line="276" w:lineRule="auto"/>
+      <w:spacing w:after="80"/>
     </w:pPr>
     <w:rPr>
       <w:rFonts w:ascii="Arial" w:hAnsi="Arial" w:eastAsia="Arial"/>
-      <w:color w:val="1F2933"/>
       <w:sz w:val="21"/>
     </w:rPr>
   </w:style>
@@ -1519,15 +538,15 @@
     <w:pPr>
       <w:keepNext/>
       <w:keepLines/>
-      <w:spacing w:before="280" w:after="120"/>
+      <w:spacing w:before="480" w:after="0"/>
       <w:outlineLvl w:val="0"/>
     </w:pPr>
     <w:rPr>
-      <w:rFonts w:asciiTheme="majorHAnsi" w:eastAsiaTheme="majorEastAsia" w:hAnsiTheme="majorHAnsi" w:cstheme="majorBidi" w:ascii="Arial" w:hAnsi="Arial" w:eastAsia="Arial"/>
+      <w:rFonts w:asciiTheme="majorHAnsi" w:eastAsiaTheme="majorEastAsia" w:hAnsiTheme="majorHAnsi" w:cstheme="majorBidi"/>
       <w:b/>
       <w:bCs/>
-      <w:color w:val="003D4A"/>
-      <w:sz w:val="32"/>
+      <w:color w:val="365F91" w:themeColor="accent1" w:themeShade="BF"/>
+      <w:sz w:val="28"/>
       <w:szCs w:val="28"/>
     </w:rPr>
   </w:style>
@@ -1543,14 +562,14 @@
     <w:pPr>
       <w:keepNext/>
       <w:keepLines/>
-      <w:spacing w:before="200" w:after="120"/>
+      <w:spacing w:before="200" w:after="0"/>
       <w:outlineLvl w:val="1"/>
     </w:pPr>
     <w:rPr>
-      <w:rFonts w:asciiTheme="majorHAnsi" w:eastAsiaTheme="majorEastAsia" w:hAnsiTheme="majorHAnsi" w:cstheme="majorBidi" w:ascii="Arial" w:hAnsi="Arial" w:eastAsia="Arial"/>
+      <w:rFonts w:asciiTheme="majorHAnsi" w:eastAsiaTheme="majorEastAsia" w:hAnsiTheme="majorHAnsi" w:cstheme="majorBidi"/>
       <w:b/>
       <w:bCs/>
-      <w:color w:val="003D4A"/>
+      <w:color w:val="4F81BD" w:themeColor="accent1"/>
       <w:sz w:val="26"/>
       <w:szCs w:val="26"/>
     </w:rPr>
@@ -1567,15 +586,14 @@
     <w:pPr>
       <w:keepNext/>
       <w:keepLines/>
-      <w:spacing w:before="200" w:after="120"/>
+      <w:spacing w:before="200" w:after="0"/>
       <w:outlineLvl w:val="2"/>
     </w:pPr>
     <w:rPr>
-      <w:rFonts w:asciiTheme="majorHAnsi" w:eastAsiaTheme="majorEastAsia" w:hAnsiTheme="majorHAnsi" w:cstheme="majorBidi" w:ascii="Arial" w:hAnsi="Arial" w:eastAsia="Arial"/>
+      <w:rFonts w:asciiTheme="majorHAnsi" w:eastAsiaTheme="majorEastAsia" w:hAnsiTheme="majorHAnsi" w:cstheme="majorBidi"/>
       <w:b/>
       <w:bCs/>
-      <w:color w:val="003D4A"/>
-      <w:sz w:val="23"/>
+      <w:color w:val="4F81BD" w:themeColor="accent1"/>
     </w:rPr>
   </w:style>
   <w:style w:type="paragraph" w:styleId="Heading4">

</xml_diff>